<commit_message>
Remove all shading from tables in the docx report
Tables previously used the 'Light Grid' built-in Word style which can
apply header/banding fills depending on the renderer. Switched to
'Table Grid' (border-only) and added a clear_cell_shading helper that
explicitly writes <w:shd w:val="clear" w:fill="FFFFFF"/> on every
cell so that no Word/LibreOffice renderer fills the table cells.

Code blocks intentionally keep their paragraph-level light fill
(#F4F4F0) since the user asked specifically about tables.

Verified: word/document.xml has 251 cell fills, all FFFFFF; 4 fills
remain at F4F4F0 and all are paragraph-level (code blocks).

Rebuilt visrag_v12_general_submit_<date>.zip.
</commit_message>
<xml_diff>
--- a/docs/report_v12_general_vs_visrag.docx
+++ b/docs/report_v12_general_vs_visrag.docx
@@ -467,7 +467,7 @@
     </w:p>
     <w:tbl>
       <w:tblPr>
-        <w:tblStyle w:val="LightGrid"/>
+        <w:tblStyle w:val="TableGrid"/>
         <w:tblW w:type="auto" w:w="0"/>
         <w:jc w:val="center"/>
         <w:tblLook w:firstColumn="1" w:firstRow="1" w:lastColumn="0" w:lastRow="0" w:noHBand="0" w:noVBand="1" w:val="04A0"/>
@@ -484,6 +484,7 @@
           <w:tcPr>
             <w:tcW w:type="dxa" w:w="1814"/>
             <w:vAlign w:val="center"/>
+            <w:shd w:val="clear" w:color="auto" w:fill="FFFFFF"/>
           </w:tcPr>
           <w:p>
             <w:pPr>
@@ -506,6 +507,7 @@
           <w:tcPr>
             <w:tcW w:type="dxa" w:w="1814"/>
             <w:vAlign w:val="center"/>
+            <w:shd w:val="clear" w:color="auto" w:fill="FFFFFF"/>
           </w:tcPr>
           <w:p>
             <w:pPr>
@@ -528,6 +530,7 @@
           <w:tcPr>
             <w:tcW w:type="dxa" w:w="1814"/>
             <w:vAlign w:val="center"/>
+            <w:shd w:val="clear" w:color="auto" w:fill="FFFFFF"/>
           </w:tcPr>
           <w:p>
             <w:pPr>
@@ -550,6 +553,7 @@
           <w:tcPr>
             <w:tcW w:type="dxa" w:w="1814"/>
             <w:vAlign w:val="center"/>
+            <w:shd w:val="clear" w:color="auto" w:fill="FFFFFF"/>
           </w:tcPr>
           <w:p>
             <w:pPr>
@@ -572,6 +576,7 @@
           <w:tcPr>
             <w:tcW w:type="dxa" w:w="1814"/>
             <w:vAlign w:val="center"/>
+            <w:shd w:val="clear" w:color="auto" w:fill="FFFFFF"/>
           </w:tcPr>
           <w:p>
             <w:pPr>
@@ -596,6 +601,7 @@
           <w:tcPr>
             <w:tcW w:type="dxa" w:w="1814"/>
             <w:vAlign w:val="center"/>
+            <w:shd w:val="clear" w:color="auto" w:fill="FFFFFF"/>
           </w:tcPr>
           <w:p>
             <w:pPr>
@@ -617,6 +623,7 @@
           <w:tcPr>
             <w:tcW w:type="dxa" w:w="1814"/>
             <w:vAlign w:val="center"/>
+            <w:shd w:val="clear" w:color="auto" w:fill="FFFFFF"/>
           </w:tcPr>
           <w:p>
             <w:pPr>
@@ -639,6 +646,7 @@
           <w:tcPr>
             <w:tcW w:type="dxa" w:w="1814"/>
             <w:vAlign w:val="center"/>
+            <w:shd w:val="clear" w:color="auto" w:fill="FFFFFF"/>
           </w:tcPr>
           <w:p>
             <w:pPr>
@@ -661,6 +669,7 @@
           <w:tcPr>
             <w:tcW w:type="dxa" w:w="1814"/>
             <w:vAlign w:val="center"/>
+            <w:shd w:val="clear" w:color="auto" w:fill="FFFFFF"/>
           </w:tcPr>
           <w:p>
             <w:pPr>
@@ -683,6 +692,7 @@
           <w:tcPr>
             <w:tcW w:type="dxa" w:w="1814"/>
             <w:vAlign w:val="center"/>
+            <w:shd w:val="clear" w:color="auto" w:fill="FFFFFF"/>
           </w:tcPr>
           <w:p>
             <w:pPr>
@@ -707,6 +717,7 @@
           <w:tcPr>
             <w:tcW w:type="dxa" w:w="1814"/>
             <w:vAlign w:val="center"/>
+            <w:shd w:val="clear" w:color="auto" w:fill="FFFFFF"/>
           </w:tcPr>
           <w:p>
             <w:pPr>
@@ -728,6 +739,7 @@
           <w:tcPr>
             <w:tcW w:type="dxa" w:w="1814"/>
             <w:vAlign w:val="center"/>
+            <w:shd w:val="clear" w:color="auto" w:fill="FFFFFF"/>
           </w:tcPr>
           <w:p>
             <w:pPr>
@@ -750,6 +762,7 @@
           <w:tcPr>
             <w:tcW w:type="dxa" w:w="1814"/>
             <w:vAlign w:val="center"/>
+            <w:shd w:val="clear" w:color="auto" w:fill="FFFFFF"/>
           </w:tcPr>
           <w:p>
             <w:pPr>
@@ -772,6 +785,7 @@
           <w:tcPr>
             <w:tcW w:type="dxa" w:w="1814"/>
             <w:vAlign w:val="center"/>
+            <w:shd w:val="clear" w:color="auto" w:fill="FFFFFF"/>
           </w:tcPr>
           <w:p>
             <w:pPr>
@@ -794,6 +808,7 @@
           <w:tcPr>
             <w:tcW w:type="dxa" w:w="1814"/>
             <w:vAlign w:val="center"/>
+            <w:shd w:val="clear" w:color="auto" w:fill="FFFFFF"/>
           </w:tcPr>
           <w:p>
             <w:pPr>
@@ -818,6 +833,7 @@
           <w:tcPr>
             <w:tcW w:type="dxa" w:w="1814"/>
             <w:vAlign w:val="center"/>
+            <w:shd w:val="clear" w:color="auto" w:fill="FFFFFF"/>
           </w:tcPr>
           <w:p>
             <w:pPr>
@@ -839,6 +855,7 @@
           <w:tcPr>
             <w:tcW w:type="dxa" w:w="1814"/>
             <w:vAlign w:val="center"/>
+            <w:shd w:val="clear" w:color="auto" w:fill="FFFFFF"/>
           </w:tcPr>
           <w:p>
             <w:pPr>
@@ -861,6 +878,7 @@
           <w:tcPr>
             <w:tcW w:type="dxa" w:w="1814"/>
             <w:vAlign w:val="center"/>
+            <w:shd w:val="clear" w:color="auto" w:fill="FFFFFF"/>
           </w:tcPr>
           <w:p>
             <w:pPr>
@@ -883,6 +901,7 @@
           <w:tcPr>
             <w:tcW w:type="dxa" w:w="1814"/>
             <w:vAlign w:val="center"/>
+            <w:shd w:val="clear" w:color="auto" w:fill="FFFFFF"/>
           </w:tcPr>
           <w:p>
             <w:pPr>
@@ -905,6 +924,7 @@
           <w:tcPr>
             <w:tcW w:type="dxa" w:w="1814"/>
             <w:vAlign w:val="center"/>
+            <w:shd w:val="clear" w:color="auto" w:fill="FFFFFF"/>
           </w:tcPr>
           <w:p>
             <w:pPr>
@@ -929,6 +949,7 @@
           <w:tcPr>
             <w:tcW w:type="dxa" w:w="1814"/>
             <w:vAlign w:val="center"/>
+            <w:shd w:val="clear" w:color="auto" w:fill="FFFFFF"/>
           </w:tcPr>
           <w:p>
             <w:pPr>
@@ -950,6 +971,7 @@
           <w:tcPr>
             <w:tcW w:type="dxa" w:w="1814"/>
             <w:vAlign w:val="center"/>
+            <w:shd w:val="clear" w:color="auto" w:fill="FFFFFF"/>
           </w:tcPr>
           <w:p>
             <w:pPr>
@@ -972,6 +994,7 @@
           <w:tcPr>
             <w:tcW w:type="dxa" w:w="1814"/>
             <w:vAlign w:val="center"/>
+            <w:shd w:val="clear" w:color="auto" w:fill="FFFFFF"/>
           </w:tcPr>
           <w:p>
             <w:pPr>
@@ -994,6 +1017,7 @@
           <w:tcPr>
             <w:tcW w:type="dxa" w:w="1814"/>
             <w:vAlign w:val="center"/>
+            <w:shd w:val="clear" w:color="auto" w:fill="FFFFFF"/>
           </w:tcPr>
           <w:p>
             <w:pPr>
@@ -1016,6 +1040,7 @@
           <w:tcPr>
             <w:tcW w:type="dxa" w:w="1814"/>
             <w:vAlign w:val="center"/>
+            <w:shd w:val="clear" w:color="auto" w:fill="FFFFFF"/>
           </w:tcPr>
           <w:p>
             <w:pPr>
@@ -1472,7 +1497,7 @@
     </w:p>
     <w:tbl>
       <w:tblPr>
-        <w:tblStyle w:val="LightGrid"/>
+        <w:tblStyle w:val="TableGrid"/>
         <w:tblW w:type="auto" w:w="0"/>
         <w:jc w:val="center"/>
         <w:tblLook w:firstColumn="1" w:firstRow="1" w:lastColumn="0" w:lastRow="0" w:noHBand="0" w:noVBand="1" w:val="04A0"/>
@@ -1487,6 +1512,7 @@
           <w:tcPr>
             <w:tcW w:type="dxa" w:w="3024"/>
             <w:vAlign w:val="center"/>
+            <w:shd w:val="clear" w:color="auto" w:fill="FFFFFF"/>
           </w:tcPr>
           <w:p>
             <w:pPr>
@@ -1509,6 +1535,7 @@
           <w:tcPr>
             <w:tcW w:type="dxa" w:w="3024"/>
             <w:vAlign w:val="center"/>
+            <w:shd w:val="clear" w:color="auto" w:fill="FFFFFF"/>
           </w:tcPr>
           <w:p>
             <w:pPr>
@@ -1531,6 +1558,7 @@
           <w:tcPr>
             <w:tcW w:type="dxa" w:w="3024"/>
             <w:vAlign w:val="center"/>
+            <w:shd w:val="clear" w:color="auto" w:fill="FFFFFF"/>
           </w:tcPr>
           <w:p>
             <w:pPr>
@@ -1555,6 +1583,7 @@
           <w:tcPr>
             <w:tcW w:type="dxa" w:w="3024"/>
             <w:vAlign w:val="center"/>
+            <w:shd w:val="clear" w:color="auto" w:fill="FFFFFF"/>
           </w:tcPr>
           <w:p>
             <w:pPr>
@@ -1576,6 +1605,7 @@
           <w:tcPr>
             <w:tcW w:type="dxa" w:w="3024"/>
             <w:vAlign w:val="center"/>
+            <w:shd w:val="clear" w:color="auto" w:fill="FFFFFF"/>
           </w:tcPr>
           <w:p>
             <w:pPr>
@@ -1597,6 +1627,7 @@
           <w:tcPr>
             <w:tcW w:type="dxa" w:w="3024"/>
             <w:vAlign w:val="center"/>
+            <w:shd w:val="clear" w:color="auto" w:fill="FFFFFF"/>
           </w:tcPr>
           <w:p>
             <w:pPr>
@@ -1620,6 +1651,7 @@
           <w:tcPr>
             <w:tcW w:type="dxa" w:w="3024"/>
             <w:vAlign w:val="center"/>
+            <w:shd w:val="clear" w:color="auto" w:fill="FFFFFF"/>
           </w:tcPr>
           <w:p>
             <w:pPr>
@@ -1641,6 +1673,7 @@
           <w:tcPr>
             <w:tcW w:type="dxa" w:w="3024"/>
             <w:vAlign w:val="center"/>
+            <w:shd w:val="clear" w:color="auto" w:fill="FFFFFF"/>
           </w:tcPr>
           <w:p>
             <w:pPr>
@@ -1662,6 +1695,7 @@
           <w:tcPr>
             <w:tcW w:type="dxa" w:w="3024"/>
             <w:vAlign w:val="center"/>
+            <w:shd w:val="clear" w:color="auto" w:fill="FFFFFF"/>
           </w:tcPr>
           <w:p>
             <w:pPr>
@@ -1685,6 +1719,7 @@
           <w:tcPr>
             <w:tcW w:type="dxa" w:w="3024"/>
             <w:vAlign w:val="center"/>
+            <w:shd w:val="clear" w:color="auto" w:fill="FFFFFF"/>
           </w:tcPr>
           <w:p>
             <w:pPr>
@@ -1706,6 +1741,7 @@
           <w:tcPr>
             <w:tcW w:type="dxa" w:w="3024"/>
             <w:vAlign w:val="center"/>
+            <w:shd w:val="clear" w:color="auto" w:fill="FFFFFF"/>
           </w:tcPr>
           <w:p>
             <w:pPr>
@@ -1727,6 +1763,7 @@
           <w:tcPr>
             <w:tcW w:type="dxa" w:w="3024"/>
             <w:vAlign w:val="center"/>
+            <w:shd w:val="clear" w:color="auto" w:fill="FFFFFF"/>
           </w:tcPr>
           <w:p>
             <w:pPr>
@@ -1857,7 +1894,7 @@
     </w:p>
     <w:tbl>
       <w:tblPr>
-        <w:tblStyle w:val="LightGrid"/>
+        <w:tblStyle w:val="TableGrid"/>
         <w:tblW w:type="auto" w:w="0"/>
         <w:jc w:val="center"/>
         <w:tblLook w:firstColumn="1" w:firstRow="1" w:lastColumn="0" w:lastRow="0" w:noHBand="0" w:noVBand="1" w:val="04A0"/>
@@ -1872,6 +1909,7 @@
           <w:tcPr>
             <w:tcW w:type="dxa" w:w="3024"/>
             <w:vAlign w:val="center"/>
+            <w:shd w:val="clear" w:color="auto" w:fill="FFFFFF"/>
           </w:tcPr>
           <w:p>
             <w:pPr>
@@ -1894,6 +1932,7 @@
           <w:tcPr>
             <w:tcW w:type="dxa" w:w="3024"/>
             <w:vAlign w:val="center"/>
+            <w:shd w:val="clear" w:color="auto" w:fill="FFFFFF"/>
           </w:tcPr>
           <w:p>
             <w:pPr>
@@ -1916,6 +1955,7 @@
           <w:tcPr>
             <w:tcW w:type="dxa" w:w="3024"/>
             <w:vAlign w:val="center"/>
+            <w:shd w:val="clear" w:color="auto" w:fill="FFFFFF"/>
           </w:tcPr>
           <w:p>
             <w:pPr>
@@ -1940,6 +1980,7 @@
           <w:tcPr>
             <w:tcW w:type="dxa" w:w="3024"/>
             <w:vAlign w:val="center"/>
+            <w:shd w:val="clear" w:color="auto" w:fill="FFFFFF"/>
           </w:tcPr>
           <w:p>
             <w:pPr>
@@ -1961,6 +2002,7 @@
           <w:tcPr>
             <w:tcW w:type="dxa" w:w="3024"/>
             <w:vAlign w:val="center"/>
+            <w:shd w:val="clear" w:color="auto" w:fill="FFFFFF"/>
           </w:tcPr>
           <w:p>
             <w:pPr>
@@ -1983,6 +2025,7 @@
           <w:tcPr>
             <w:tcW w:type="dxa" w:w="3024"/>
             <w:vAlign w:val="center"/>
+            <w:shd w:val="clear" w:color="auto" w:fill="FFFFFF"/>
           </w:tcPr>
           <w:p>
             <w:pPr>
@@ -2006,6 +2049,7 @@
           <w:tcPr>
             <w:tcW w:type="dxa" w:w="3024"/>
             <w:vAlign w:val="center"/>
+            <w:shd w:val="clear" w:color="auto" w:fill="FFFFFF"/>
           </w:tcPr>
           <w:p>
             <w:pPr>
@@ -2027,6 +2071,7 @@
           <w:tcPr>
             <w:tcW w:type="dxa" w:w="3024"/>
             <w:vAlign w:val="center"/>
+            <w:shd w:val="clear" w:color="auto" w:fill="FFFFFF"/>
           </w:tcPr>
           <w:p>
             <w:pPr>
@@ -2049,6 +2094,7 @@
           <w:tcPr>
             <w:tcW w:type="dxa" w:w="3024"/>
             <w:vAlign w:val="center"/>
+            <w:shd w:val="clear" w:color="auto" w:fill="FFFFFF"/>
           </w:tcPr>
           <w:p>
             <w:pPr>
@@ -2072,6 +2118,7 @@
           <w:tcPr>
             <w:tcW w:type="dxa" w:w="3024"/>
             <w:vAlign w:val="center"/>
+            <w:shd w:val="clear" w:color="auto" w:fill="FFFFFF"/>
           </w:tcPr>
           <w:p>
             <w:pPr>
@@ -2093,6 +2140,7 @@
           <w:tcPr>
             <w:tcW w:type="dxa" w:w="3024"/>
             <w:vAlign w:val="center"/>
+            <w:shd w:val="clear" w:color="auto" w:fill="FFFFFF"/>
           </w:tcPr>
           <w:p>
             <w:pPr>
@@ -2115,6 +2163,7 @@
           <w:tcPr>
             <w:tcW w:type="dxa" w:w="3024"/>
             <w:vAlign w:val="center"/>
+            <w:shd w:val="clear" w:color="auto" w:fill="FFFFFF"/>
           </w:tcPr>
           <w:p>
             <w:pPr>
@@ -2138,6 +2187,7 @@
           <w:tcPr>
             <w:tcW w:type="dxa" w:w="3024"/>
             <w:vAlign w:val="center"/>
+            <w:shd w:val="clear" w:color="auto" w:fill="FFFFFF"/>
           </w:tcPr>
           <w:p>
             <w:pPr>
@@ -2159,6 +2209,7 @@
           <w:tcPr>
             <w:tcW w:type="dxa" w:w="3024"/>
             <w:vAlign w:val="center"/>
+            <w:shd w:val="clear" w:color="auto" w:fill="FFFFFF"/>
           </w:tcPr>
           <w:p>
             <w:pPr>
@@ -2181,6 +2232,7 @@
           <w:tcPr>
             <w:tcW w:type="dxa" w:w="3024"/>
             <w:vAlign w:val="center"/>
+            <w:shd w:val="clear" w:color="auto" w:fill="FFFFFF"/>
           </w:tcPr>
           <w:p>
             <w:pPr>
@@ -2204,6 +2256,7 @@
           <w:tcPr>
             <w:tcW w:type="dxa" w:w="3024"/>
             <w:vAlign w:val="center"/>
+            <w:shd w:val="clear" w:color="auto" w:fill="FFFFFF"/>
           </w:tcPr>
           <w:p>
             <w:pPr>
@@ -2225,6 +2278,7 @@
           <w:tcPr>
             <w:tcW w:type="dxa" w:w="3024"/>
             <w:vAlign w:val="center"/>
+            <w:shd w:val="clear" w:color="auto" w:fill="FFFFFF"/>
           </w:tcPr>
           <w:p>
             <w:pPr>
@@ -2247,6 +2301,7 @@
           <w:tcPr>
             <w:tcW w:type="dxa" w:w="3024"/>
             <w:vAlign w:val="center"/>
+            <w:shd w:val="clear" w:color="auto" w:fill="FFFFFF"/>
           </w:tcPr>
           <w:p>
             <w:pPr>
@@ -2270,6 +2325,7 @@
           <w:tcPr>
             <w:tcW w:type="dxa" w:w="3024"/>
             <w:vAlign w:val="center"/>
+            <w:shd w:val="clear" w:color="auto" w:fill="FFFFFF"/>
           </w:tcPr>
           <w:p>
             <w:pPr>
@@ -2291,6 +2347,7 @@
           <w:tcPr>
             <w:tcW w:type="dxa" w:w="3024"/>
             <w:vAlign w:val="center"/>
+            <w:shd w:val="clear" w:color="auto" w:fill="FFFFFF"/>
           </w:tcPr>
           <w:p>
             <w:pPr>
@@ -2313,6 +2370,7 @@
           <w:tcPr>
             <w:tcW w:type="dxa" w:w="3024"/>
             <w:vAlign w:val="center"/>
+            <w:shd w:val="clear" w:color="auto" w:fill="FFFFFF"/>
           </w:tcPr>
           <w:p>
             <w:pPr>
@@ -2393,7 +2451,7 @@
     </w:p>
     <w:tbl>
       <w:tblPr>
-        <w:tblStyle w:val="LightGrid"/>
+        <w:tblStyle w:val="TableGrid"/>
         <w:tblW w:type="auto" w:w="0"/>
         <w:jc w:val="center"/>
         <w:tblLook w:firstColumn="1" w:firstRow="1" w:lastColumn="0" w:lastRow="0" w:noHBand="0" w:noVBand="1" w:val="04A0"/>
@@ -2408,6 +2466,7 @@
           <w:tcPr>
             <w:tcW w:type="dxa" w:w="3024"/>
             <w:vAlign w:val="center"/>
+            <w:shd w:val="clear" w:color="auto" w:fill="FFFFFF"/>
           </w:tcPr>
           <w:p>
             <w:pPr>
@@ -2430,6 +2489,7 @@
           <w:tcPr>
             <w:tcW w:type="dxa" w:w="3024"/>
             <w:vAlign w:val="center"/>
+            <w:shd w:val="clear" w:color="auto" w:fill="FFFFFF"/>
           </w:tcPr>
           <w:p>
             <w:pPr>
@@ -2452,6 +2512,7 @@
           <w:tcPr>
             <w:tcW w:type="dxa" w:w="3024"/>
             <w:vAlign w:val="center"/>
+            <w:shd w:val="clear" w:color="auto" w:fill="FFFFFF"/>
           </w:tcPr>
           <w:p>
             <w:pPr>
@@ -2476,6 +2537,7 @@
           <w:tcPr>
             <w:tcW w:type="dxa" w:w="3024"/>
             <w:vAlign w:val="center"/>
+            <w:shd w:val="clear" w:color="auto" w:fill="FFFFFF"/>
           </w:tcPr>
           <w:p>
             <w:pPr>
@@ -2497,6 +2559,7 @@
           <w:tcPr>
             <w:tcW w:type="dxa" w:w="3024"/>
             <w:vAlign w:val="center"/>
+            <w:shd w:val="clear" w:color="auto" w:fill="FFFFFF"/>
           </w:tcPr>
           <w:p>
             <w:pPr>
@@ -2518,6 +2581,7 @@
           <w:tcPr>
             <w:tcW w:type="dxa" w:w="3024"/>
             <w:vAlign w:val="center"/>
+            <w:shd w:val="clear" w:color="auto" w:fill="FFFFFF"/>
           </w:tcPr>
           <w:p>
             <w:pPr>
@@ -2541,6 +2605,7 @@
           <w:tcPr>
             <w:tcW w:type="dxa" w:w="3024"/>
             <w:vAlign w:val="center"/>
+            <w:shd w:val="clear" w:color="auto" w:fill="FFFFFF"/>
           </w:tcPr>
           <w:p>
             <w:pPr>
@@ -2562,6 +2627,7 @@
           <w:tcPr>
             <w:tcW w:type="dxa" w:w="3024"/>
             <w:vAlign w:val="center"/>
+            <w:shd w:val="clear" w:color="auto" w:fill="FFFFFF"/>
           </w:tcPr>
           <w:p>
             <w:pPr>
@@ -2583,6 +2649,7 @@
           <w:tcPr>
             <w:tcW w:type="dxa" w:w="3024"/>
             <w:vAlign w:val="center"/>
+            <w:shd w:val="clear" w:color="auto" w:fill="FFFFFF"/>
           </w:tcPr>
           <w:p>
             <w:pPr>
@@ -2606,6 +2673,7 @@
           <w:tcPr>
             <w:tcW w:type="dxa" w:w="3024"/>
             <w:vAlign w:val="center"/>
+            <w:shd w:val="clear" w:color="auto" w:fill="FFFFFF"/>
           </w:tcPr>
           <w:p>
             <w:pPr>
@@ -2627,6 +2695,7 @@
           <w:tcPr>
             <w:tcW w:type="dxa" w:w="3024"/>
             <w:vAlign w:val="center"/>
+            <w:shd w:val="clear" w:color="auto" w:fill="FFFFFF"/>
           </w:tcPr>
           <w:p>
             <w:pPr>
@@ -2648,6 +2717,7 @@
           <w:tcPr>
             <w:tcW w:type="dxa" w:w="3024"/>
             <w:vAlign w:val="center"/>
+            <w:shd w:val="clear" w:color="auto" w:fill="FFFFFF"/>
           </w:tcPr>
           <w:p>
             <w:pPr>
@@ -2671,6 +2741,7 @@
           <w:tcPr>
             <w:tcW w:type="dxa" w:w="3024"/>
             <w:vAlign w:val="center"/>
+            <w:shd w:val="clear" w:color="auto" w:fill="FFFFFF"/>
           </w:tcPr>
           <w:p>
             <w:pPr>
@@ -2692,6 +2763,7 @@
           <w:tcPr>
             <w:tcW w:type="dxa" w:w="3024"/>
             <w:vAlign w:val="center"/>
+            <w:shd w:val="clear" w:color="auto" w:fill="FFFFFF"/>
           </w:tcPr>
           <w:p>
             <w:pPr>
@@ -2713,6 +2785,7 @@
           <w:tcPr>
             <w:tcW w:type="dxa" w:w="3024"/>
             <w:vAlign w:val="center"/>
+            <w:shd w:val="clear" w:color="auto" w:fill="FFFFFF"/>
           </w:tcPr>
           <w:p>
             <w:pPr>
@@ -2776,7 +2849,7 @@
     </w:p>
     <w:tbl>
       <w:tblPr>
-        <w:tblStyle w:val="LightGrid"/>
+        <w:tblStyle w:val="TableGrid"/>
         <w:tblW w:type="auto" w:w="0"/>
         <w:jc w:val="center"/>
         <w:tblLook w:firstColumn="1" w:firstRow="1" w:lastColumn="0" w:lastRow="0" w:noHBand="0" w:noVBand="1" w:val="04A0"/>
@@ -2791,6 +2864,7 @@
           <w:tcPr>
             <w:tcW w:type="dxa" w:w="3024"/>
             <w:vAlign w:val="center"/>
+            <w:shd w:val="clear" w:color="auto" w:fill="FFFFFF"/>
           </w:tcPr>
           <w:p>
             <w:pPr>
@@ -2813,6 +2887,7 @@
           <w:tcPr>
             <w:tcW w:type="dxa" w:w="3024"/>
             <w:vAlign w:val="center"/>
+            <w:shd w:val="clear" w:color="auto" w:fill="FFFFFF"/>
           </w:tcPr>
           <w:p>
             <w:pPr>
@@ -2835,6 +2910,7 @@
           <w:tcPr>
             <w:tcW w:type="dxa" w:w="3024"/>
             <w:vAlign w:val="center"/>
+            <w:shd w:val="clear" w:color="auto" w:fill="FFFFFF"/>
           </w:tcPr>
           <w:p>
             <w:pPr>
@@ -2859,6 +2935,7 @@
           <w:tcPr>
             <w:tcW w:type="dxa" w:w="3024"/>
             <w:vAlign w:val="center"/>
+            <w:shd w:val="clear" w:color="auto" w:fill="FFFFFF"/>
           </w:tcPr>
           <w:p>
             <w:pPr>
@@ -2880,6 +2957,7 @@
           <w:tcPr>
             <w:tcW w:type="dxa" w:w="3024"/>
             <w:vAlign w:val="center"/>
+            <w:shd w:val="clear" w:color="auto" w:fill="FFFFFF"/>
           </w:tcPr>
           <w:p>
             <w:pPr>
@@ -2901,6 +2979,7 @@
           <w:tcPr>
             <w:tcW w:type="dxa" w:w="3024"/>
             <w:vAlign w:val="center"/>
+            <w:shd w:val="clear" w:color="auto" w:fill="FFFFFF"/>
           </w:tcPr>
           <w:p>
             <w:pPr>
@@ -2924,6 +3003,7 @@
           <w:tcPr>
             <w:tcW w:type="dxa" w:w="3024"/>
             <w:vAlign w:val="center"/>
+            <w:shd w:val="clear" w:color="auto" w:fill="FFFFFF"/>
           </w:tcPr>
           <w:p>
             <w:pPr>
@@ -2945,6 +3025,7 @@
           <w:tcPr>
             <w:tcW w:type="dxa" w:w="3024"/>
             <w:vAlign w:val="center"/>
+            <w:shd w:val="clear" w:color="auto" w:fill="FFFFFF"/>
           </w:tcPr>
           <w:p>
             <w:pPr>
@@ -2966,6 +3047,7 @@
           <w:tcPr>
             <w:tcW w:type="dxa" w:w="3024"/>
             <w:vAlign w:val="center"/>
+            <w:shd w:val="clear" w:color="auto" w:fill="FFFFFF"/>
           </w:tcPr>
           <w:p>
             <w:pPr>
@@ -2989,6 +3071,7 @@
           <w:tcPr>
             <w:tcW w:type="dxa" w:w="3024"/>
             <w:vAlign w:val="center"/>
+            <w:shd w:val="clear" w:color="auto" w:fill="FFFFFF"/>
           </w:tcPr>
           <w:p>
             <w:pPr>
@@ -3010,6 +3093,7 @@
           <w:tcPr>
             <w:tcW w:type="dxa" w:w="3024"/>
             <w:vAlign w:val="center"/>
+            <w:shd w:val="clear" w:color="auto" w:fill="FFFFFF"/>
           </w:tcPr>
           <w:p>
             <w:pPr>
@@ -3031,6 +3115,7 @@
           <w:tcPr>
             <w:tcW w:type="dxa" w:w="3024"/>
             <w:vAlign w:val="center"/>
+            <w:shd w:val="clear" w:color="auto" w:fill="FFFFFF"/>
           </w:tcPr>
           <w:p>
             <w:pPr>
@@ -3054,6 +3139,7 @@
           <w:tcPr>
             <w:tcW w:type="dxa" w:w="3024"/>
             <w:vAlign w:val="center"/>
+            <w:shd w:val="clear" w:color="auto" w:fill="FFFFFF"/>
           </w:tcPr>
           <w:p>
             <w:pPr>
@@ -3075,6 +3161,7 @@
           <w:tcPr>
             <w:tcW w:type="dxa" w:w="3024"/>
             <w:vAlign w:val="center"/>
+            <w:shd w:val="clear" w:color="auto" w:fill="FFFFFF"/>
           </w:tcPr>
           <w:p>
             <w:pPr>
@@ -3096,6 +3183,7 @@
           <w:tcPr>
             <w:tcW w:type="dxa" w:w="3024"/>
             <w:vAlign w:val="center"/>
+            <w:shd w:val="clear" w:color="auto" w:fill="FFFFFF"/>
           </w:tcPr>
           <w:p>
             <w:pPr>
@@ -3119,6 +3207,7 @@
           <w:tcPr>
             <w:tcW w:type="dxa" w:w="3024"/>
             <w:vAlign w:val="center"/>
+            <w:shd w:val="clear" w:color="auto" w:fill="FFFFFF"/>
           </w:tcPr>
           <w:p>
             <w:pPr>
@@ -3140,6 +3229,7 @@
           <w:tcPr>
             <w:tcW w:type="dxa" w:w="3024"/>
             <w:vAlign w:val="center"/>
+            <w:shd w:val="clear" w:color="auto" w:fill="FFFFFF"/>
           </w:tcPr>
           <w:p>
             <w:pPr>
@@ -3161,6 +3251,7 @@
           <w:tcPr>
             <w:tcW w:type="dxa" w:w="3024"/>
             <w:vAlign w:val="center"/>
+            <w:shd w:val="clear" w:color="auto" w:fill="FFFFFF"/>
           </w:tcPr>
           <w:p>
             <w:pPr>
@@ -3184,6 +3275,7 @@
           <w:tcPr>
             <w:tcW w:type="dxa" w:w="3024"/>
             <w:vAlign w:val="center"/>
+            <w:shd w:val="clear" w:color="auto" w:fill="FFFFFF"/>
           </w:tcPr>
           <w:p>
             <w:pPr>
@@ -3205,6 +3297,7 @@
           <w:tcPr>
             <w:tcW w:type="dxa" w:w="3024"/>
             <w:vAlign w:val="center"/>
+            <w:shd w:val="clear" w:color="auto" w:fill="FFFFFF"/>
           </w:tcPr>
           <w:p>
             <w:pPr>
@@ -3226,6 +3319,7 @@
           <w:tcPr>
             <w:tcW w:type="dxa" w:w="3024"/>
             <w:vAlign w:val="center"/>
+            <w:shd w:val="clear" w:color="auto" w:fill="FFFFFF"/>
           </w:tcPr>
           <w:p>
             <w:pPr>
@@ -3249,6 +3343,7 @@
           <w:tcPr>
             <w:tcW w:type="dxa" w:w="3024"/>
             <w:vAlign w:val="center"/>
+            <w:shd w:val="clear" w:color="auto" w:fill="FFFFFF"/>
           </w:tcPr>
           <w:p>
             <w:pPr>
@@ -3270,6 +3365,7 @@
           <w:tcPr>
             <w:tcW w:type="dxa" w:w="3024"/>
             <w:vAlign w:val="center"/>
+            <w:shd w:val="clear" w:color="auto" w:fill="FFFFFF"/>
           </w:tcPr>
           <w:p>
             <w:pPr>
@@ -3291,6 +3387,7 @@
           <w:tcPr>
             <w:tcW w:type="dxa" w:w="3024"/>
             <w:vAlign w:val="center"/>
+            <w:shd w:val="clear" w:color="auto" w:fill="FFFFFF"/>
           </w:tcPr>
           <w:p>
             <w:pPr>
@@ -3314,6 +3411,7 @@
           <w:tcPr>
             <w:tcW w:type="dxa" w:w="3024"/>
             <w:vAlign w:val="center"/>
+            <w:shd w:val="clear" w:color="auto" w:fill="FFFFFF"/>
           </w:tcPr>
           <w:p>
             <w:pPr>
@@ -3335,6 +3433,7 @@
           <w:tcPr>
             <w:tcW w:type="dxa" w:w="3024"/>
             <w:vAlign w:val="center"/>
+            <w:shd w:val="clear" w:color="auto" w:fill="FFFFFF"/>
           </w:tcPr>
           <w:p>
             <w:pPr>
@@ -3356,6 +3455,7 @@
           <w:tcPr>
             <w:tcW w:type="dxa" w:w="3024"/>
             <w:vAlign w:val="center"/>
+            <w:shd w:val="clear" w:color="auto" w:fill="FFFFFF"/>
           </w:tcPr>
           <w:p>
             <w:pPr>
@@ -3379,6 +3479,7 @@
           <w:tcPr>
             <w:tcW w:type="dxa" w:w="3024"/>
             <w:vAlign w:val="center"/>
+            <w:shd w:val="clear" w:color="auto" w:fill="FFFFFF"/>
           </w:tcPr>
           <w:p>
             <w:pPr>
@@ -3400,6 +3501,7 @@
           <w:tcPr>
             <w:tcW w:type="dxa" w:w="3024"/>
             <w:vAlign w:val="center"/>
+            <w:shd w:val="clear" w:color="auto" w:fill="FFFFFF"/>
           </w:tcPr>
           <w:p>
             <w:pPr>
@@ -3421,6 +3523,7 @@
           <w:tcPr>
             <w:tcW w:type="dxa" w:w="3024"/>
             <w:vAlign w:val="center"/>
+            <w:shd w:val="clear" w:color="auto" w:fill="FFFFFF"/>
           </w:tcPr>
           <w:p>
             <w:pPr>
@@ -3444,6 +3547,7 @@
           <w:tcPr>
             <w:tcW w:type="dxa" w:w="3024"/>
             <w:vAlign w:val="center"/>
+            <w:shd w:val="clear" w:color="auto" w:fill="FFFFFF"/>
           </w:tcPr>
           <w:p>
             <w:pPr>
@@ -3465,6 +3569,7 @@
           <w:tcPr>
             <w:tcW w:type="dxa" w:w="3024"/>
             <w:vAlign w:val="center"/>
+            <w:shd w:val="clear" w:color="auto" w:fill="FFFFFF"/>
           </w:tcPr>
           <w:p>
             <w:pPr>
@@ -3486,6 +3591,7 @@
           <w:tcPr>
             <w:tcW w:type="dxa" w:w="3024"/>
             <w:vAlign w:val="center"/>
+            <w:shd w:val="clear" w:color="auto" w:fill="FFFFFF"/>
           </w:tcPr>
           <w:p>
             <w:pPr>
@@ -3509,6 +3615,7 @@
           <w:tcPr>
             <w:tcW w:type="dxa" w:w="3024"/>
             <w:vAlign w:val="center"/>
+            <w:shd w:val="clear" w:color="auto" w:fill="FFFFFF"/>
           </w:tcPr>
           <w:p>
             <w:pPr>
@@ -3530,6 +3637,7 @@
           <w:tcPr>
             <w:tcW w:type="dxa" w:w="3024"/>
             <w:vAlign w:val="center"/>
+            <w:shd w:val="clear" w:color="auto" w:fill="FFFFFF"/>
           </w:tcPr>
           <w:p>
             <w:pPr>
@@ -3551,6 +3659,7 @@
           <w:tcPr>
             <w:tcW w:type="dxa" w:w="3024"/>
             <w:vAlign w:val="center"/>
+            <w:shd w:val="clear" w:color="auto" w:fill="FFFFFF"/>
           </w:tcPr>
           <w:p>
             <w:pPr>
@@ -3870,7 +3979,7 @@
     </w:p>
     <w:tbl>
       <w:tblPr>
-        <w:tblStyle w:val="LightGrid"/>
+        <w:tblStyle w:val="TableGrid"/>
         <w:tblW w:type="auto" w:w="0"/>
         <w:jc w:val="center"/>
         <w:tblLook w:firstColumn="1" w:firstRow="1" w:lastColumn="0" w:lastRow="0" w:noHBand="0" w:noVBand="1" w:val="04A0"/>
@@ -3885,6 +3994,7 @@
           <w:tcPr>
             <w:tcW w:type="dxa" w:w="3024"/>
             <w:vAlign w:val="center"/>
+            <w:shd w:val="clear" w:color="auto" w:fill="FFFFFF"/>
           </w:tcPr>
           <w:p>
             <w:pPr>
@@ -3907,6 +4017,7 @@
           <w:tcPr>
             <w:tcW w:type="dxa" w:w="3024"/>
             <w:vAlign w:val="center"/>
+            <w:shd w:val="clear" w:color="auto" w:fill="FFFFFF"/>
           </w:tcPr>
           <w:p>
             <w:pPr>
@@ -3929,6 +4040,7 @@
           <w:tcPr>
             <w:tcW w:type="dxa" w:w="3024"/>
             <w:vAlign w:val="center"/>
+            <w:shd w:val="clear" w:color="auto" w:fill="FFFFFF"/>
           </w:tcPr>
           <w:p>
             <w:pPr>
@@ -3953,6 +4065,7 @@
           <w:tcPr>
             <w:tcW w:type="dxa" w:w="3024"/>
             <w:vAlign w:val="center"/>
+            <w:shd w:val="clear" w:color="auto" w:fill="FFFFFF"/>
           </w:tcPr>
           <w:p>
             <w:pPr>
@@ -3974,6 +4087,7 @@
           <w:tcPr>
             <w:tcW w:type="dxa" w:w="3024"/>
             <w:vAlign w:val="center"/>
+            <w:shd w:val="clear" w:color="auto" w:fill="FFFFFF"/>
           </w:tcPr>
           <w:p>
             <w:pPr>
@@ -3995,6 +4109,7 @@
           <w:tcPr>
             <w:tcW w:type="dxa" w:w="3024"/>
             <w:vAlign w:val="center"/>
+            <w:shd w:val="clear" w:color="auto" w:fill="FFFFFF"/>
           </w:tcPr>
           <w:p>
             <w:pPr>
@@ -4018,6 +4133,7 @@
           <w:tcPr>
             <w:tcW w:type="dxa" w:w="3024"/>
             <w:vAlign w:val="center"/>
+            <w:shd w:val="clear" w:color="auto" w:fill="FFFFFF"/>
           </w:tcPr>
           <w:p>
             <w:pPr>
@@ -4039,6 +4155,7 @@
           <w:tcPr>
             <w:tcW w:type="dxa" w:w="3024"/>
             <w:vAlign w:val="center"/>
+            <w:shd w:val="clear" w:color="auto" w:fill="FFFFFF"/>
           </w:tcPr>
           <w:p>
             <w:pPr>
@@ -4060,6 +4177,7 @@
           <w:tcPr>
             <w:tcW w:type="dxa" w:w="3024"/>
             <w:vAlign w:val="center"/>
+            <w:shd w:val="clear" w:color="auto" w:fill="FFFFFF"/>
           </w:tcPr>
           <w:p>
             <w:pPr>
@@ -4083,6 +4201,7 @@
           <w:tcPr>
             <w:tcW w:type="dxa" w:w="3024"/>
             <w:vAlign w:val="center"/>
+            <w:shd w:val="clear" w:color="auto" w:fill="FFFFFF"/>
           </w:tcPr>
           <w:p>
             <w:pPr>
@@ -4104,6 +4223,7 @@
           <w:tcPr>
             <w:tcW w:type="dxa" w:w="3024"/>
             <w:vAlign w:val="center"/>
+            <w:shd w:val="clear" w:color="auto" w:fill="FFFFFF"/>
           </w:tcPr>
           <w:p>
             <w:pPr>
@@ -4125,6 +4245,7 @@
           <w:tcPr>
             <w:tcW w:type="dxa" w:w="3024"/>
             <w:vAlign w:val="center"/>
+            <w:shd w:val="clear" w:color="auto" w:fill="FFFFFF"/>
           </w:tcPr>
           <w:p>
             <w:pPr>
@@ -4148,6 +4269,7 @@
           <w:tcPr>
             <w:tcW w:type="dxa" w:w="3024"/>
             <w:vAlign w:val="center"/>
+            <w:shd w:val="clear" w:color="auto" w:fill="FFFFFF"/>
           </w:tcPr>
           <w:p>
             <w:pPr>
@@ -4169,6 +4291,7 @@
           <w:tcPr>
             <w:tcW w:type="dxa" w:w="3024"/>
             <w:vAlign w:val="center"/>
+            <w:shd w:val="clear" w:color="auto" w:fill="FFFFFF"/>
           </w:tcPr>
           <w:p>
             <w:pPr>
@@ -4190,6 +4313,7 @@
           <w:tcPr>
             <w:tcW w:type="dxa" w:w="3024"/>
             <w:vAlign w:val="center"/>
+            <w:shd w:val="clear" w:color="auto" w:fill="FFFFFF"/>
           </w:tcPr>
           <w:p>
             <w:pPr>
@@ -4213,6 +4337,7 @@
           <w:tcPr>
             <w:tcW w:type="dxa" w:w="3024"/>
             <w:vAlign w:val="center"/>
+            <w:shd w:val="clear" w:color="auto" w:fill="FFFFFF"/>
           </w:tcPr>
           <w:p>
             <w:pPr>
@@ -4234,6 +4359,7 @@
           <w:tcPr>
             <w:tcW w:type="dxa" w:w="3024"/>
             <w:vAlign w:val="center"/>
+            <w:shd w:val="clear" w:color="auto" w:fill="FFFFFF"/>
           </w:tcPr>
           <w:p>
             <w:pPr>
@@ -4255,6 +4381,7 @@
           <w:tcPr>
             <w:tcW w:type="dxa" w:w="3024"/>
             <w:vAlign w:val="center"/>
+            <w:shd w:val="clear" w:color="auto" w:fill="FFFFFF"/>
           </w:tcPr>
           <w:p>
             <w:pPr>
@@ -4278,6 +4405,7 @@
           <w:tcPr>
             <w:tcW w:type="dxa" w:w="3024"/>
             <w:vAlign w:val="center"/>
+            <w:shd w:val="clear" w:color="auto" w:fill="FFFFFF"/>
           </w:tcPr>
           <w:p>
             <w:pPr>
@@ -4299,6 +4427,7 @@
           <w:tcPr>
             <w:tcW w:type="dxa" w:w="3024"/>
             <w:vAlign w:val="center"/>
+            <w:shd w:val="clear" w:color="auto" w:fill="FFFFFF"/>
           </w:tcPr>
           <w:p>
             <w:pPr>
@@ -4320,6 +4449,7 @@
           <w:tcPr>
             <w:tcW w:type="dxa" w:w="3024"/>
             <w:vAlign w:val="center"/>
+            <w:shd w:val="clear" w:color="auto" w:fill="FFFFFF"/>
           </w:tcPr>
           <w:p>
             <w:pPr>
@@ -4583,7 +4713,7 @@
     </w:p>
     <w:tbl>
       <w:tblPr>
-        <w:tblStyle w:val="LightGrid"/>
+        <w:tblStyle w:val="TableGrid"/>
         <w:tblW w:type="auto" w:w="0"/>
         <w:jc w:val="center"/>
         <w:tblLook w:firstColumn="1" w:firstRow="1" w:lastColumn="0" w:lastRow="0" w:noHBand="0" w:noVBand="1" w:val="04A0"/>
@@ -4599,6 +4729,7 @@
           <w:tcPr>
             <w:tcW w:type="dxa" w:w="2268"/>
             <w:vAlign w:val="center"/>
+            <w:shd w:val="clear" w:color="auto" w:fill="FFFFFF"/>
           </w:tcPr>
           <w:p>
             <w:pPr>
@@ -4621,6 +4752,7 @@
           <w:tcPr>
             <w:tcW w:type="dxa" w:w="2268"/>
             <w:vAlign w:val="center"/>
+            <w:shd w:val="clear" w:color="auto" w:fill="FFFFFF"/>
           </w:tcPr>
           <w:p>
             <w:pPr>
@@ -4643,6 +4775,7 @@
           <w:tcPr>
             <w:tcW w:type="dxa" w:w="2268"/>
             <w:vAlign w:val="center"/>
+            <w:shd w:val="clear" w:color="auto" w:fill="FFFFFF"/>
           </w:tcPr>
           <w:p>
             <w:pPr>
@@ -4665,6 +4798,7 @@
           <w:tcPr>
             <w:tcW w:type="dxa" w:w="2268"/>
             <w:vAlign w:val="center"/>
+            <w:shd w:val="clear" w:color="auto" w:fill="FFFFFF"/>
           </w:tcPr>
           <w:p>
             <w:pPr>
@@ -4689,6 +4823,7 @@
           <w:tcPr>
             <w:tcW w:type="dxa" w:w="2268"/>
             <w:vAlign w:val="center"/>
+            <w:shd w:val="clear" w:color="auto" w:fill="FFFFFF"/>
           </w:tcPr>
           <w:p>
             <w:pPr>
@@ -4710,6 +4845,7 @@
           <w:tcPr>
             <w:tcW w:type="dxa" w:w="2268"/>
             <w:vAlign w:val="center"/>
+            <w:shd w:val="clear" w:color="auto" w:fill="FFFFFF"/>
           </w:tcPr>
           <w:p>
             <w:pPr>
@@ -4731,6 +4867,7 @@
           <w:tcPr>
             <w:tcW w:type="dxa" w:w="2268"/>
             <w:vAlign w:val="center"/>
+            <w:shd w:val="clear" w:color="auto" w:fill="FFFFFF"/>
           </w:tcPr>
           <w:p>
             <w:pPr>
@@ -4752,6 +4889,7 @@
           <w:tcPr>
             <w:tcW w:type="dxa" w:w="2268"/>
             <w:vAlign w:val="center"/>
+            <w:shd w:val="clear" w:color="auto" w:fill="FFFFFF"/>
           </w:tcPr>
           <w:p>
             <w:pPr>
@@ -4775,6 +4913,7 @@
           <w:tcPr>
             <w:tcW w:type="dxa" w:w="2268"/>
             <w:vAlign w:val="center"/>
+            <w:shd w:val="clear" w:color="auto" w:fill="FFFFFF"/>
           </w:tcPr>
           <w:p>
             <w:pPr>
@@ -4796,6 +4935,7 @@
           <w:tcPr>
             <w:tcW w:type="dxa" w:w="2268"/>
             <w:vAlign w:val="center"/>
+            <w:shd w:val="clear" w:color="auto" w:fill="FFFFFF"/>
           </w:tcPr>
           <w:p>
             <w:pPr>
@@ -4817,6 +4957,7 @@
           <w:tcPr>
             <w:tcW w:type="dxa" w:w="2268"/>
             <w:vAlign w:val="center"/>
+            <w:shd w:val="clear" w:color="auto" w:fill="FFFFFF"/>
           </w:tcPr>
           <w:p>
             <w:pPr>
@@ -4838,6 +4979,7 @@
           <w:tcPr>
             <w:tcW w:type="dxa" w:w="2268"/>
             <w:vAlign w:val="center"/>
+            <w:shd w:val="clear" w:color="auto" w:fill="FFFFFF"/>
           </w:tcPr>
           <w:p>
             <w:pPr>
@@ -4861,6 +5003,7 @@
           <w:tcPr>
             <w:tcW w:type="dxa" w:w="2268"/>
             <w:vAlign w:val="center"/>
+            <w:shd w:val="clear" w:color="auto" w:fill="FFFFFF"/>
           </w:tcPr>
           <w:p>
             <w:pPr>
@@ -4882,6 +5025,7 @@
           <w:tcPr>
             <w:tcW w:type="dxa" w:w="2268"/>
             <w:vAlign w:val="center"/>
+            <w:shd w:val="clear" w:color="auto" w:fill="FFFFFF"/>
           </w:tcPr>
           <w:p>
             <w:pPr>
@@ -4903,6 +5047,7 @@
           <w:tcPr>
             <w:tcW w:type="dxa" w:w="2268"/>
             <w:vAlign w:val="center"/>
+            <w:shd w:val="clear" w:color="auto" w:fill="FFFFFF"/>
           </w:tcPr>
           <w:p>
             <w:pPr>
@@ -4924,6 +5069,7 @@
           <w:tcPr>
             <w:tcW w:type="dxa" w:w="2268"/>
             <w:vAlign w:val="center"/>
+            <w:shd w:val="clear" w:color="auto" w:fill="FFFFFF"/>
           </w:tcPr>
           <w:p>
             <w:pPr>
@@ -4947,6 +5093,7 @@
           <w:tcPr>
             <w:tcW w:type="dxa" w:w="2268"/>
             <w:vAlign w:val="center"/>
+            <w:shd w:val="clear" w:color="auto" w:fill="FFFFFF"/>
           </w:tcPr>
           <w:p>
             <w:pPr>
@@ -4968,6 +5115,7 @@
           <w:tcPr>
             <w:tcW w:type="dxa" w:w="2268"/>
             <w:vAlign w:val="center"/>
+            <w:shd w:val="clear" w:color="auto" w:fill="FFFFFF"/>
           </w:tcPr>
           <w:p>
             <w:pPr>
@@ -4989,6 +5137,7 @@
           <w:tcPr>
             <w:tcW w:type="dxa" w:w="2268"/>
             <w:vAlign w:val="center"/>
+            <w:shd w:val="clear" w:color="auto" w:fill="FFFFFF"/>
           </w:tcPr>
           <w:p>
             <w:pPr>
@@ -5010,6 +5159,7 @@
           <w:tcPr>
             <w:tcW w:type="dxa" w:w="2268"/>
             <w:vAlign w:val="center"/>
+            <w:shd w:val="clear" w:color="auto" w:fill="FFFFFF"/>
           </w:tcPr>
           <w:p>
             <w:pPr>
@@ -5033,6 +5183,7 @@
           <w:tcPr>
             <w:tcW w:type="dxa" w:w="2268"/>
             <w:vAlign w:val="center"/>
+            <w:shd w:val="clear" w:color="auto" w:fill="FFFFFF"/>
           </w:tcPr>
           <w:p>
             <w:pPr>
@@ -5054,6 +5205,7 @@
           <w:tcPr>
             <w:tcW w:type="dxa" w:w="2268"/>
             <w:vAlign w:val="center"/>
+            <w:shd w:val="clear" w:color="auto" w:fill="FFFFFF"/>
           </w:tcPr>
           <w:p>
             <w:pPr>
@@ -5075,6 +5227,7 @@
           <w:tcPr>
             <w:tcW w:type="dxa" w:w="2268"/>
             <w:vAlign w:val="center"/>
+            <w:shd w:val="clear" w:color="auto" w:fill="FFFFFF"/>
           </w:tcPr>
           <w:p>
             <w:pPr>
@@ -5096,6 +5249,7 @@
           <w:tcPr>
             <w:tcW w:type="dxa" w:w="2268"/>
             <w:vAlign w:val="center"/>
+            <w:shd w:val="clear" w:color="auto" w:fill="FFFFFF"/>
           </w:tcPr>
           <w:p>
             <w:pPr>
@@ -5119,6 +5273,7 @@
           <w:tcPr>
             <w:tcW w:type="dxa" w:w="2268"/>
             <w:vAlign w:val="center"/>
+            <w:shd w:val="clear" w:color="auto" w:fill="FFFFFF"/>
           </w:tcPr>
           <w:p>
             <w:pPr>
@@ -5140,6 +5295,7 @@
           <w:tcPr>
             <w:tcW w:type="dxa" w:w="2268"/>
             <w:vAlign w:val="center"/>
+            <w:shd w:val="clear" w:color="auto" w:fill="FFFFFF"/>
           </w:tcPr>
           <w:p>
             <w:pPr>
@@ -5161,6 +5317,7 @@
           <w:tcPr>
             <w:tcW w:type="dxa" w:w="2268"/>
             <w:vAlign w:val="center"/>
+            <w:shd w:val="clear" w:color="auto" w:fill="FFFFFF"/>
           </w:tcPr>
           <w:p>
             <w:pPr>
@@ -5182,6 +5339,7 @@
           <w:tcPr>
             <w:tcW w:type="dxa" w:w="2268"/>
             <w:vAlign w:val="center"/>
+            <w:shd w:val="clear" w:color="auto" w:fill="FFFFFF"/>
           </w:tcPr>
           <w:p>
             <w:pPr>
@@ -5205,6 +5363,7 @@
           <w:tcPr>
             <w:tcW w:type="dxa" w:w="2268"/>
             <w:vAlign w:val="center"/>
+            <w:shd w:val="clear" w:color="auto" w:fill="FFFFFF"/>
           </w:tcPr>
           <w:p>
             <w:pPr>
@@ -5226,6 +5385,7 @@
           <w:tcPr>
             <w:tcW w:type="dxa" w:w="2268"/>
             <w:vAlign w:val="center"/>
+            <w:shd w:val="clear" w:color="auto" w:fill="FFFFFF"/>
           </w:tcPr>
           <w:p>
             <w:pPr>
@@ -5247,6 +5407,7 @@
           <w:tcPr>
             <w:tcW w:type="dxa" w:w="2268"/>
             <w:vAlign w:val="center"/>
+            <w:shd w:val="clear" w:color="auto" w:fill="FFFFFF"/>
           </w:tcPr>
           <w:p>
             <w:pPr>
@@ -5268,6 +5429,7 @@
           <w:tcPr>
             <w:tcW w:type="dxa" w:w="2268"/>
             <w:vAlign w:val="center"/>
+            <w:shd w:val="clear" w:color="auto" w:fill="FFFFFF"/>
           </w:tcPr>
           <w:p>
             <w:pPr>
@@ -5291,6 +5453,7 @@
           <w:tcPr>
             <w:tcW w:type="dxa" w:w="2268"/>
             <w:vAlign w:val="center"/>
+            <w:shd w:val="clear" w:color="auto" w:fill="FFFFFF"/>
           </w:tcPr>
           <w:p>
             <w:pPr>
@@ -5312,6 +5475,7 @@
           <w:tcPr>
             <w:tcW w:type="dxa" w:w="2268"/>
             <w:vAlign w:val="center"/>
+            <w:shd w:val="clear" w:color="auto" w:fill="FFFFFF"/>
           </w:tcPr>
           <w:p>
             <w:pPr>
@@ -5333,6 +5497,7 @@
           <w:tcPr>
             <w:tcW w:type="dxa" w:w="2268"/>
             <w:vAlign w:val="center"/>
+            <w:shd w:val="clear" w:color="auto" w:fill="FFFFFF"/>
           </w:tcPr>
           <w:p>
             <w:pPr>
@@ -5354,6 +5519,7 @@
           <w:tcPr>
             <w:tcW w:type="dxa" w:w="2268"/>
             <w:vAlign w:val="center"/>
+            <w:shd w:val="clear" w:color="auto" w:fill="FFFFFF"/>
           </w:tcPr>
           <w:p>
             <w:pPr>
@@ -5377,6 +5543,7 @@
           <w:tcPr>
             <w:tcW w:type="dxa" w:w="2268"/>
             <w:vAlign w:val="center"/>
+            <w:shd w:val="clear" w:color="auto" w:fill="FFFFFF"/>
           </w:tcPr>
           <w:p>
             <w:pPr>
@@ -5398,6 +5565,7 @@
           <w:tcPr>
             <w:tcW w:type="dxa" w:w="2268"/>
             <w:vAlign w:val="center"/>
+            <w:shd w:val="clear" w:color="auto" w:fill="FFFFFF"/>
           </w:tcPr>
           <w:p>
             <w:pPr>
@@ -5419,6 +5587,7 @@
           <w:tcPr>
             <w:tcW w:type="dxa" w:w="2268"/>
             <w:vAlign w:val="center"/>
+            <w:shd w:val="clear" w:color="auto" w:fill="FFFFFF"/>
           </w:tcPr>
           <w:p>
             <w:pPr>
@@ -5440,6 +5609,7 @@
           <w:tcPr>
             <w:tcW w:type="dxa" w:w="2268"/>
             <w:vAlign w:val="center"/>
+            <w:shd w:val="clear" w:color="auto" w:fill="FFFFFF"/>
           </w:tcPr>
           <w:p>
             <w:pPr>
@@ -5536,7 +5706,7 @@
     </w:p>
     <w:tbl>
       <w:tblPr>
-        <w:tblStyle w:val="LightGrid"/>
+        <w:tblStyle w:val="TableGrid"/>
         <w:tblW w:type="auto" w:w="0"/>
         <w:jc w:val="center"/>
         <w:tblLook w:firstColumn="1" w:firstRow="1" w:lastColumn="0" w:lastRow="0" w:noHBand="0" w:noVBand="1" w:val="04A0"/>
@@ -5555,6 +5725,7 @@
           <w:tcPr>
             <w:tcW w:type="dxa" w:w="1296"/>
             <w:vAlign w:val="center"/>
+            <w:shd w:val="clear" w:color="auto" w:fill="FFFFFF"/>
           </w:tcPr>
           <w:p>
             <w:pPr>
@@ -5577,6 +5748,7 @@
           <w:tcPr>
             <w:tcW w:type="dxa" w:w="1296"/>
             <w:vAlign w:val="center"/>
+            <w:shd w:val="clear" w:color="auto" w:fill="FFFFFF"/>
           </w:tcPr>
           <w:p>
             <w:pPr>
@@ -5599,6 +5771,7 @@
           <w:tcPr>
             <w:tcW w:type="dxa" w:w="1296"/>
             <w:vAlign w:val="center"/>
+            <w:shd w:val="clear" w:color="auto" w:fill="FFFFFF"/>
           </w:tcPr>
           <w:p>
             <w:pPr>
@@ -5621,6 +5794,7 @@
           <w:tcPr>
             <w:tcW w:type="dxa" w:w="1296"/>
             <w:vAlign w:val="center"/>
+            <w:shd w:val="clear" w:color="auto" w:fill="FFFFFF"/>
           </w:tcPr>
           <w:p>
             <w:pPr>
@@ -5643,6 +5817,7 @@
           <w:tcPr>
             <w:tcW w:type="dxa" w:w="1296"/>
             <w:vAlign w:val="center"/>
+            <w:shd w:val="clear" w:color="auto" w:fill="FFFFFF"/>
           </w:tcPr>
           <w:p>
             <w:pPr>
@@ -5665,6 +5840,7 @@
           <w:tcPr>
             <w:tcW w:type="dxa" w:w="1296"/>
             <w:vAlign w:val="center"/>
+            <w:shd w:val="clear" w:color="auto" w:fill="FFFFFF"/>
           </w:tcPr>
           <w:p>
             <w:pPr>
@@ -5687,6 +5863,7 @@
           <w:tcPr>
             <w:tcW w:type="dxa" w:w="1296"/>
             <w:vAlign w:val="center"/>
+            <w:shd w:val="clear" w:color="auto" w:fill="FFFFFF"/>
           </w:tcPr>
           <w:p>
             <w:pPr>
@@ -5711,6 +5888,7 @@
           <w:tcPr>
             <w:tcW w:type="dxa" w:w="1296"/>
             <w:vAlign w:val="center"/>
+            <w:shd w:val="clear" w:color="auto" w:fill="FFFFFF"/>
           </w:tcPr>
           <w:p>
             <w:pPr>
@@ -5732,6 +5910,7 @@
           <w:tcPr>
             <w:tcW w:type="dxa" w:w="1296"/>
             <w:vAlign w:val="center"/>
+            <w:shd w:val="clear" w:color="auto" w:fill="FFFFFF"/>
           </w:tcPr>
           <w:p>
             <w:pPr>
@@ -5754,6 +5933,7 @@
           <w:tcPr>
             <w:tcW w:type="dxa" w:w="1296"/>
             <w:vAlign w:val="center"/>
+            <w:shd w:val="clear" w:color="auto" w:fill="FFFFFF"/>
           </w:tcPr>
           <w:p>
             <w:pPr>
@@ -5776,6 +5956,7 @@
           <w:tcPr>
             <w:tcW w:type="dxa" w:w="1296"/>
             <w:vAlign w:val="center"/>
+            <w:shd w:val="clear" w:color="auto" w:fill="FFFFFF"/>
           </w:tcPr>
           <w:p>
             <w:pPr>
@@ -5798,6 +5979,7 @@
           <w:tcPr>
             <w:tcW w:type="dxa" w:w="1296"/>
             <w:vAlign w:val="center"/>
+            <w:shd w:val="clear" w:color="auto" w:fill="FFFFFF"/>
           </w:tcPr>
           <w:p>
             <w:pPr>
@@ -5820,6 +6002,7 @@
           <w:tcPr>
             <w:tcW w:type="dxa" w:w="1296"/>
             <w:vAlign w:val="center"/>
+            <w:shd w:val="clear" w:color="auto" w:fill="FFFFFF"/>
           </w:tcPr>
           <w:p>
             <w:pPr>
@@ -5842,6 +6025,7 @@
           <w:tcPr>
             <w:tcW w:type="dxa" w:w="1296"/>
             <w:vAlign w:val="center"/>
+            <w:shd w:val="clear" w:color="auto" w:fill="FFFFFF"/>
           </w:tcPr>
           <w:p>
             <w:pPr>
@@ -5866,6 +6050,7 @@
           <w:tcPr>
             <w:tcW w:type="dxa" w:w="1296"/>
             <w:vAlign w:val="center"/>
+            <w:shd w:val="clear" w:color="auto" w:fill="FFFFFF"/>
           </w:tcPr>
           <w:p>
             <w:pPr>
@@ -5887,6 +6072,7 @@
           <w:tcPr>
             <w:tcW w:type="dxa" w:w="1296"/>
             <w:vAlign w:val="center"/>
+            <w:shd w:val="clear" w:color="auto" w:fill="FFFFFF"/>
           </w:tcPr>
           <w:p>
             <w:pPr>
@@ -5909,6 +6095,7 @@
           <w:tcPr>
             <w:tcW w:type="dxa" w:w="1296"/>
             <w:vAlign w:val="center"/>
+            <w:shd w:val="clear" w:color="auto" w:fill="FFFFFF"/>
           </w:tcPr>
           <w:p>
             <w:pPr>
@@ -5931,6 +6118,7 @@
           <w:tcPr>
             <w:tcW w:type="dxa" w:w="1296"/>
             <w:vAlign w:val="center"/>
+            <w:shd w:val="clear" w:color="auto" w:fill="FFFFFF"/>
           </w:tcPr>
           <w:p>
             <w:pPr>
@@ -5953,6 +6141,7 @@
           <w:tcPr>
             <w:tcW w:type="dxa" w:w="1296"/>
             <w:vAlign w:val="center"/>
+            <w:shd w:val="clear" w:color="auto" w:fill="FFFFFF"/>
           </w:tcPr>
           <w:p>
             <w:pPr>
@@ -5975,6 +6164,7 @@
           <w:tcPr>
             <w:tcW w:type="dxa" w:w="1296"/>
             <w:vAlign w:val="center"/>
+            <w:shd w:val="clear" w:color="auto" w:fill="FFFFFF"/>
           </w:tcPr>
           <w:p>
             <w:pPr>
@@ -5997,6 +6187,7 @@
           <w:tcPr>
             <w:tcW w:type="dxa" w:w="1296"/>
             <w:vAlign w:val="center"/>
+            <w:shd w:val="clear" w:color="auto" w:fill="FFFFFF"/>
           </w:tcPr>
           <w:p>
             <w:pPr>
@@ -6021,6 +6212,7 @@
           <w:tcPr>
             <w:tcW w:type="dxa" w:w="1296"/>
             <w:vAlign w:val="center"/>
+            <w:shd w:val="clear" w:color="auto" w:fill="FFFFFF"/>
           </w:tcPr>
           <w:p>
             <w:pPr>
@@ -6042,6 +6234,7 @@
           <w:tcPr>
             <w:tcW w:type="dxa" w:w="1296"/>
             <w:vAlign w:val="center"/>
+            <w:shd w:val="clear" w:color="auto" w:fill="FFFFFF"/>
           </w:tcPr>
           <w:p>
             <w:pPr>
@@ -6064,6 +6257,7 @@
           <w:tcPr>
             <w:tcW w:type="dxa" w:w="1296"/>
             <w:vAlign w:val="center"/>
+            <w:shd w:val="clear" w:color="auto" w:fill="FFFFFF"/>
           </w:tcPr>
           <w:p>
             <w:pPr>
@@ -6086,6 +6280,7 @@
           <w:tcPr>
             <w:tcW w:type="dxa" w:w="1296"/>
             <w:vAlign w:val="center"/>
+            <w:shd w:val="clear" w:color="auto" w:fill="FFFFFF"/>
           </w:tcPr>
           <w:p>
             <w:pPr>
@@ -6108,6 +6303,7 @@
           <w:tcPr>
             <w:tcW w:type="dxa" w:w="1296"/>
             <w:vAlign w:val="center"/>
+            <w:shd w:val="clear" w:color="auto" w:fill="FFFFFF"/>
           </w:tcPr>
           <w:p>
             <w:pPr>
@@ -6130,6 +6326,7 @@
           <w:tcPr>
             <w:tcW w:type="dxa" w:w="1296"/>
             <w:vAlign w:val="center"/>
+            <w:shd w:val="clear" w:color="auto" w:fill="FFFFFF"/>
           </w:tcPr>
           <w:p>
             <w:pPr>
@@ -6152,6 +6349,7 @@
           <w:tcPr>
             <w:tcW w:type="dxa" w:w="1296"/>
             <w:vAlign w:val="center"/>
+            <w:shd w:val="clear" w:color="auto" w:fill="FFFFFF"/>
           </w:tcPr>
           <w:p>
             <w:pPr>
@@ -6216,7 +6414,7 @@
     </w:p>
     <w:tbl>
       <w:tblPr>
-        <w:tblStyle w:val="LightGrid"/>
+        <w:tblStyle w:val="TableGrid"/>
         <w:tblW w:type="auto" w:w="0"/>
         <w:jc w:val="center"/>
         <w:tblLook w:firstColumn="1" w:firstRow="1" w:lastColumn="0" w:lastRow="0" w:noHBand="0" w:noVBand="1" w:val="04A0"/>
@@ -6232,6 +6430,7 @@
           <w:tcPr>
             <w:tcW w:type="dxa" w:w="2268"/>
             <w:vAlign w:val="center"/>
+            <w:shd w:val="clear" w:color="auto" w:fill="FFFFFF"/>
           </w:tcPr>
           <w:p>
             <w:pPr>
@@ -6254,6 +6453,7 @@
           <w:tcPr>
             <w:tcW w:type="dxa" w:w="2268"/>
             <w:vAlign w:val="center"/>
+            <w:shd w:val="clear" w:color="auto" w:fill="FFFFFF"/>
           </w:tcPr>
           <w:p>
             <w:pPr>
@@ -6276,6 +6476,7 @@
           <w:tcPr>
             <w:tcW w:type="dxa" w:w="2268"/>
             <w:vAlign w:val="center"/>
+            <w:shd w:val="clear" w:color="auto" w:fill="FFFFFF"/>
           </w:tcPr>
           <w:p>
             <w:pPr>
@@ -6298,6 +6499,7 @@
           <w:tcPr>
             <w:tcW w:type="dxa" w:w="2268"/>
             <w:vAlign w:val="center"/>
+            <w:shd w:val="clear" w:color="auto" w:fill="FFFFFF"/>
           </w:tcPr>
           <w:p>
             <w:pPr>
@@ -6322,6 +6524,7 @@
           <w:tcPr>
             <w:tcW w:type="dxa" w:w="2268"/>
             <w:vAlign w:val="center"/>
+            <w:shd w:val="clear" w:color="auto" w:fill="FFFFFF"/>
           </w:tcPr>
           <w:p>
             <w:pPr>
@@ -6343,6 +6546,7 @@
           <w:tcPr>
             <w:tcW w:type="dxa" w:w="2268"/>
             <w:vAlign w:val="center"/>
+            <w:shd w:val="clear" w:color="auto" w:fill="FFFFFF"/>
           </w:tcPr>
           <w:p>
             <w:pPr>
@@ -6365,6 +6569,7 @@
           <w:tcPr>
             <w:tcW w:type="dxa" w:w="2268"/>
             <w:vAlign w:val="center"/>
+            <w:shd w:val="clear" w:color="auto" w:fill="FFFFFF"/>
           </w:tcPr>
           <w:p>
             <w:pPr>
@@ -6387,6 +6592,7 @@
           <w:tcPr>
             <w:tcW w:type="dxa" w:w="2268"/>
             <w:vAlign w:val="center"/>
+            <w:shd w:val="clear" w:color="auto" w:fill="FFFFFF"/>
           </w:tcPr>
           <w:p>
             <w:pPr>
@@ -6411,6 +6617,7 @@
           <w:tcPr>
             <w:tcW w:type="dxa" w:w="2268"/>
             <w:vAlign w:val="center"/>
+            <w:shd w:val="clear" w:color="auto" w:fill="FFFFFF"/>
           </w:tcPr>
           <w:p>
             <w:pPr>
@@ -6432,6 +6639,7 @@
           <w:tcPr>
             <w:tcW w:type="dxa" w:w="2268"/>
             <w:vAlign w:val="center"/>
+            <w:shd w:val="clear" w:color="auto" w:fill="FFFFFF"/>
           </w:tcPr>
           <w:p>
             <w:pPr>
@@ -6454,6 +6662,7 @@
           <w:tcPr>
             <w:tcW w:type="dxa" w:w="2268"/>
             <w:vAlign w:val="center"/>
+            <w:shd w:val="clear" w:color="auto" w:fill="FFFFFF"/>
           </w:tcPr>
           <w:p>
             <w:pPr>
@@ -6476,6 +6685,7 @@
           <w:tcPr>
             <w:tcW w:type="dxa" w:w="2268"/>
             <w:vAlign w:val="center"/>
+            <w:shd w:val="clear" w:color="auto" w:fill="FFFFFF"/>
           </w:tcPr>
           <w:p>
             <w:pPr>
@@ -6500,6 +6710,7 @@
           <w:tcPr>
             <w:tcW w:type="dxa" w:w="2268"/>
             <w:vAlign w:val="center"/>
+            <w:shd w:val="clear" w:color="auto" w:fill="FFFFFF"/>
           </w:tcPr>
           <w:p>
             <w:pPr>
@@ -6521,6 +6732,7 @@
           <w:tcPr>
             <w:tcW w:type="dxa" w:w="2268"/>
             <w:vAlign w:val="center"/>
+            <w:shd w:val="clear" w:color="auto" w:fill="FFFFFF"/>
           </w:tcPr>
           <w:p>
             <w:pPr>
@@ -6543,6 +6755,7 @@
           <w:tcPr>
             <w:tcW w:type="dxa" w:w="2268"/>
             <w:vAlign w:val="center"/>
+            <w:shd w:val="clear" w:color="auto" w:fill="FFFFFF"/>
           </w:tcPr>
           <w:p>
             <w:pPr>
@@ -6565,6 +6778,7 @@
           <w:tcPr>
             <w:tcW w:type="dxa" w:w="2268"/>
             <w:vAlign w:val="center"/>
+            <w:shd w:val="clear" w:color="auto" w:fill="FFFFFF"/>
           </w:tcPr>
           <w:p>
             <w:pPr>
@@ -6589,6 +6803,7 @@
           <w:tcPr>
             <w:tcW w:type="dxa" w:w="2268"/>
             <w:vAlign w:val="center"/>
+            <w:shd w:val="clear" w:color="auto" w:fill="FFFFFF"/>
           </w:tcPr>
           <w:p>
             <w:pPr>
@@ -6610,6 +6825,7 @@
           <w:tcPr>
             <w:tcW w:type="dxa" w:w="2268"/>
             <w:vAlign w:val="center"/>
+            <w:shd w:val="clear" w:color="auto" w:fill="FFFFFF"/>
           </w:tcPr>
           <w:p>
             <w:pPr>
@@ -6632,6 +6848,7 @@
           <w:tcPr>
             <w:tcW w:type="dxa" w:w="2268"/>
             <w:vAlign w:val="center"/>
+            <w:shd w:val="clear" w:color="auto" w:fill="FFFFFF"/>
           </w:tcPr>
           <w:p>
             <w:pPr>
@@ -6654,6 +6871,7 @@
           <w:tcPr>
             <w:tcW w:type="dxa" w:w="2268"/>
             <w:vAlign w:val="center"/>
+            <w:shd w:val="clear" w:color="auto" w:fill="FFFFFF"/>
           </w:tcPr>
           <w:p>
             <w:pPr>
@@ -7356,7 +7574,7 @@
     </w:p>
     <w:tbl>
       <w:tblPr>
-        <w:tblStyle w:val="LightGrid"/>
+        <w:tblStyle w:val="TableGrid"/>
         <w:tblW w:type="auto" w:w="0"/>
         <w:jc w:val="center"/>
         <w:tblLook w:firstColumn="1" w:firstRow="1" w:lastColumn="0" w:lastRow="0" w:noHBand="0" w:noVBand="1" w:val="04A0"/>
@@ -7370,6 +7588,7 @@
           <w:tcPr>
             <w:tcW w:type="dxa" w:w="4536"/>
             <w:vAlign w:val="center"/>
+            <w:shd w:val="clear" w:color="auto" w:fill="FFFFFF"/>
           </w:tcPr>
           <w:p>
             <w:pPr>
@@ -7392,6 +7611,7 @@
           <w:tcPr>
             <w:tcW w:type="dxa" w:w="4536"/>
             <w:vAlign w:val="center"/>
+            <w:shd w:val="clear" w:color="auto" w:fill="FFFFFF"/>
           </w:tcPr>
           <w:p>
             <w:pPr>
@@ -7416,6 +7636,7 @@
           <w:tcPr>
             <w:tcW w:type="dxa" w:w="4536"/>
             <w:vAlign w:val="center"/>
+            <w:shd w:val="clear" w:color="auto" w:fill="FFFFFF"/>
           </w:tcPr>
           <w:p>
             <w:pPr>
@@ -7437,6 +7658,7 @@
           <w:tcPr>
             <w:tcW w:type="dxa" w:w="4536"/>
             <w:vAlign w:val="center"/>
+            <w:shd w:val="clear" w:color="auto" w:fill="FFFFFF"/>
           </w:tcPr>
           <w:p>
             <w:pPr>
@@ -7460,6 +7682,7 @@
           <w:tcPr>
             <w:tcW w:type="dxa" w:w="4536"/>
             <w:vAlign w:val="center"/>
+            <w:shd w:val="clear" w:color="auto" w:fill="FFFFFF"/>
           </w:tcPr>
           <w:p>
             <w:pPr>
@@ -7481,6 +7704,7 @@
           <w:tcPr>
             <w:tcW w:type="dxa" w:w="4536"/>
             <w:vAlign w:val="center"/>
+            <w:shd w:val="clear" w:color="auto" w:fill="FFFFFF"/>
           </w:tcPr>
           <w:p>
             <w:pPr>
@@ -7504,6 +7728,7 @@
           <w:tcPr>
             <w:tcW w:type="dxa" w:w="4536"/>
             <w:vAlign w:val="center"/>
+            <w:shd w:val="clear" w:color="auto" w:fill="FFFFFF"/>
           </w:tcPr>
           <w:p>
             <w:pPr>
@@ -7525,6 +7750,7 @@
           <w:tcPr>
             <w:tcW w:type="dxa" w:w="4536"/>
             <w:vAlign w:val="center"/>
+            <w:shd w:val="clear" w:color="auto" w:fill="FFFFFF"/>
           </w:tcPr>
           <w:p>
             <w:pPr>
@@ -7548,6 +7774,7 @@
           <w:tcPr>
             <w:tcW w:type="dxa" w:w="4536"/>
             <w:vAlign w:val="center"/>
+            <w:shd w:val="clear" w:color="auto" w:fill="FFFFFF"/>
           </w:tcPr>
           <w:p>
             <w:pPr>
@@ -7569,6 +7796,7 @@
           <w:tcPr>
             <w:tcW w:type="dxa" w:w="4536"/>
             <w:vAlign w:val="center"/>
+            <w:shd w:val="clear" w:color="auto" w:fill="FFFFFF"/>
           </w:tcPr>
           <w:p>
             <w:pPr>
@@ -7592,6 +7820,7 @@
           <w:tcPr>
             <w:tcW w:type="dxa" w:w="4536"/>
             <w:vAlign w:val="center"/>
+            <w:shd w:val="clear" w:color="auto" w:fill="FFFFFF"/>
           </w:tcPr>
           <w:p>
             <w:pPr>
@@ -7613,6 +7842,7 @@
           <w:tcPr>
             <w:tcW w:type="dxa" w:w="4536"/>
             <w:vAlign w:val="center"/>
+            <w:shd w:val="clear" w:color="auto" w:fill="FFFFFF"/>
           </w:tcPr>
           <w:p>
             <w:pPr>
@@ -7636,6 +7866,7 @@
           <w:tcPr>
             <w:tcW w:type="dxa" w:w="4536"/>
             <w:vAlign w:val="center"/>
+            <w:shd w:val="clear" w:color="auto" w:fill="FFFFFF"/>
           </w:tcPr>
           <w:p>
             <w:pPr>
@@ -7657,6 +7888,7 @@
           <w:tcPr>
             <w:tcW w:type="dxa" w:w="4536"/>
             <w:vAlign w:val="center"/>
+            <w:shd w:val="clear" w:color="auto" w:fill="FFFFFF"/>
           </w:tcPr>
           <w:p>
             <w:pPr>
@@ -7680,6 +7912,7 @@
           <w:tcPr>
             <w:tcW w:type="dxa" w:w="4536"/>
             <w:vAlign w:val="center"/>
+            <w:shd w:val="clear" w:color="auto" w:fill="FFFFFF"/>
           </w:tcPr>
           <w:p>
             <w:pPr>
@@ -7701,6 +7934,7 @@
           <w:tcPr>
             <w:tcW w:type="dxa" w:w="4536"/>
             <w:vAlign w:val="center"/>
+            <w:shd w:val="clear" w:color="auto" w:fill="FFFFFF"/>
           </w:tcPr>
           <w:p>
             <w:pPr>
@@ -7724,6 +7958,7 @@
           <w:tcPr>
             <w:tcW w:type="dxa" w:w="4536"/>
             <w:vAlign w:val="center"/>
+            <w:shd w:val="clear" w:color="auto" w:fill="FFFFFF"/>
           </w:tcPr>
           <w:p>
             <w:pPr>
@@ -7745,6 +7980,7 @@
           <w:tcPr>
             <w:tcW w:type="dxa" w:w="4536"/>
             <w:vAlign w:val="center"/>
+            <w:shd w:val="clear" w:color="auto" w:fill="FFFFFF"/>
           </w:tcPr>
           <w:p>
             <w:pPr>
@@ -8159,7 +8395,7 @@
     </w:p>
     <w:tbl>
       <w:tblPr>
-        <w:tblStyle w:val="LightGrid"/>
+        <w:tblStyle w:val="TableGrid"/>
         <w:tblW w:type="auto" w:w="0"/>
         <w:jc w:val="center"/>
         <w:tblLook w:firstColumn="1" w:firstRow="1" w:lastColumn="0" w:lastRow="0" w:noHBand="0" w:noVBand="1" w:val="04A0"/>
@@ -8174,6 +8410,7 @@
           <w:tcPr>
             <w:tcW w:type="dxa" w:w="3024"/>
             <w:vAlign w:val="center"/>
+            <w:shd w:val="clear" w:color="auto" w:fill="FFFFFF"/>
           </w:tcPr>
           <w:p>
             <w:pPr>
@@ -8196,6 +8433,7 @@
           <w:tcPr>
             <w:tcW w:type="dxa" w:w="3024"/>
             <w:vAlign w:val="center"/>
+            <w:shd w:val="clear" w:color="auto" w:fill="FFFFFF"/>
           </w:tcPr>
           <w:p>
             <w:pPr>
@@ -8218,6 +8456,7 @@
           <w:tcPr>
             <w:tcW w:type="dxa" w:w="3024"/>
             <w:vAlign w:val="center"/>
+            <w:shd w:val="clear" w:color="auto" w:fill="FFFFFF"/>
           </w:tcPr>
           <w:p>
             <w:pPr>
@@ -8242,6 +8481,7 @@
           <w:tcPr>
             <w:tcW w:type="dxa" w:w="3024"/>
             <w:vAlign w:val="center"/>
+            <w:shd w:val="clear" w:color="auto" w:fill="FFFFFF"/>
           </w:tcPr>
           <w:p>
             <w:pPr>
@@ -8263,6 +8503,7 @@
           <w:tcPr>
             <w:tcW w:type="dxa" w:w="3024"/>
             <w:vAlign w:val="center"/>
+            <w:shd w:val="clear" w:color="auto" w:fill="FFFFFF"/>
           </w:tcPr>
           <w:p>
             <w:pPr>
@@ -8285,6 +8526,7 @@
           <w:tcPr>
             <w:tcW w:type="dxa" w:w="3024"/>
             <w:vAlign w:val="center"/>
+            <w:shd w:val="clear" w:color="auto" w:fill="FFFFFF"/>
           </w:tcPr>
           <w:p>
             <w:pPr>
@@ -8309,6 +8551,7 @@
           <w:tcPr>
             <w:tcW w:type="dxa" w:w="3024"/>
             <w:vAlign w:val="center"/>
+            <w:shd w:val="clear" w:color="auto" w:fill="FFFFFF"/>
           </w:tcPr>
           <w:p>
             <w:pPr>
@@ -8330,6 +8573,7 @@
           <w:tcPr>
             <w:tcW w:type="dxa" w:w="3024"/>
             <w:vAlign w:val="center"/>
+            <w:shd w:val="clear" w:color="auto" w:fill="FFFFFF"/>
           </w:tcPr>
           <w:p>
             <w:pPr>
@@ -8352,6 +8596,7 @@
           <w:tcPr>
             <w:tcW w:type="dxa" w:w="3024"/>
             <w:vAlign w:val="center"/>
+            <w:shd w:val="clear" w:color="auto" w:fill="FFFFFF"/>
           </w:tcPr>
           <w:p>
             <w:pPr>
@@ -8376,6 +8621,7 @@
           <w:tcPr>
             <w:tcW w:type="dxa" w:w="3024"/>
             <w:vAlign w:val="center"/>
+            <w:shd w:val="clear" w:color="auto" w:fill="FFFFFF"/>
           </w:tcPr>
           <w:p>
             <w:pPr>
@@ -8397,6 +8643,7 @@
           <w:tcPr>
             <w:tcW w:type="dxa" w:w="3024"/>
             <w:vAlign w:val="center"/>
+            <w:shd w:val="clear" w:color="auto" w:fill="FFFFFF"/>
           </w:tcPr>
           <w:p>
             <w:pPr>
@@ -8419,6 +8666,7 @@
           <w:tcPr>
             <w:tcW w:type="dxa" w:w="3024"/>
             <w:vAlign w:val="center"/>
+            <w:shd w:val="clear" w:color="auto" w:fill="FFFFFF"/>
           </w:tcPr>
           <w:p>
             <w:pPr>
@@ -8443,6 +8691,7 @@
           <w:tcPr>
             <w:tcW w:type="dxa" w:w="3024"/>
             <w:vAlign w:val="center"/>
+            <w:shd w:val="clear" w:color="auto" w:fill="FFFFFF"/>
           </w:tcPr>
           <w:p>
             <w:pPr>
@@ -8464,6 +8713,7 @@
           <w:tcPr>
             <w:tcW w:type="dxa" w:w="3024"/>
             <w:vAlign w:val="center"/>
+            <w:shd w:val="clear" w:color="auto" w:fill="FFFFFF"/>
           </w:tcPr>
           <w:p>
             <w:pPr>
@@ -8486,6 +8736,7 @@
           <w:tcPr>
             <w:tcW w:type="dxa" w:w="3024"/>
             <w:vAlign w:val="center"/>
+            <w:shd w:val="clear" w:color="auto" w:fill="FFFFFF"/>
           </w:tcPr>
           <w:p>
             <w:pPr>

</xml_diff>